<commit_message>
Build V5 job-ready recruiter portfolio
</commit_message>
<xml_diff>
--- a/Bheki_Christopher_Thobela_CV.docx
+++ b/Bheki_Christopher_Thobela_CV.docx
@@ -2,901 +2,682 @@
 <file path=word/document.xml><?xml version="1.0" encoding="utf-8"?>
 <w:document xmlns:wpc="http://schemas.microsoft.com/office/word/2010/wordprocessingCanvas" xmlns:mo="http://schemas.microsoft.com/office/mac/office/2008/main" xmlns:mc="http://schemas.openxmlformats.org/markup-compatibility/2006" xmlns:mv="urn:schemas-microsoft-com:mac:vml" xmlns:o="urn:schemas-microsoft-com:office:office" xmlns:r="http://schemas.openxmlformats.org/officeDocument/2006/relationships" xmlns:m="http://schemas.openxmlformats.org/officeDocument/2006/math" xmlns:v="urn:schemas-microsoft-com:vml" xmlns:wp14="http://schemas.microsoft.com/office/word/2010/wordprocessingDrawing" xmlns:wp="http://schemas.openxmlformats.org/drawingml/2006/wordprocessingDrawing" xmlns:w10="urn:schemas-microsoft-com:office:word" xmlns:w="http://schemas.openxmlformats.org/wordprocessingml/2006/main" xmlns:w14="http://schemas.microsoft.com/office/word/2010/wordml" xmlns:wpg="http://schemas.microsoft.com/office/word/2010/wordprocessingGroup" xmlns:wpi="http://schemas.microsoft.com/office/word/2010/wordprocessingInk" xmlns:wne="http://schemas.microsoft.com/office/word/2006/wordml" xmlns:wps="http://schemas.microsoft.com/office/word/2010/wordprocessingShape" mc:Ignorable="w14 wp14">
   <w:body>
-    <w:tbl>
-      <w:tblPr>
-        <w:tblW w:type="auto" w:w="0"/>
-        <w:jc w:val="center"/>
-        <w:tblLayout w:type="autofit"/>
-        <w:tblLook w:firstColumn="1" w:firstRow="1" w:lastColumn="0" w:lastRow="0" w:noHBand="0" w:noVBand="1" w:val="04A0"/>
-      </w:tblPr>
-      <w:tblGrid>
-        <w:gridCol w:w="10570"/>
-      </w:tblGrid>
-      <w:tr>
-        <w:tc>
-          <w:tcPr>
-            <w:tcW w:type="dxa" w:w="10570"/>
-            <w:shd w:fill="14243A"/>
-            <w:tcMar>
-              <w:top w:w="115" w:type="dxa"/>
-              <w:start w:w="150" w:type="dxa"/>
-              <w:bottom w:w="105" w:type="dxa"/>
-              <w:end w:w="150" w:type="dxa"/>
-            </w:tcMar>
-          </w:tcPr>
-          <w:p>
-            <w:pPr>
-              <w:jc w:val="center"/>
-            </w:pPr>
-            <w:r>
-              <w:rPr>
-                <w:rFonts w:ascii="Aptos Display" w:hAnsi="Aptos Display"/>
-                <w:b/>
-                <w:color w:val="FFFFFF"/>
-                <w:sz w:val="40"/>
-              </w:rPr>
-              <w:t>BHEKI CHRISTOPHER THOBELA</w:t>
-            </w:r>
-          </w:p>
-          <w:p>
-            <w:pPr>
-              <w:jc w:val="center"/>
-            </w:pPr>
-            <w:r>
-              <w:rPr>
-                <w:b/>
-                <w:color w:val="D9E7F2"/>
-                <w:sz w:val="19"/>
-              </w:rPr>
-              <w:t>Music Producer  |  Recording Engineer  |  A&amp;R &amp; Artist Development  |  Music Business Professional</w:t>
-            </w:r>
-          </w:p>
-          <w:p>
-            <w:pPr>
-              <w:jc w:val="center"/>
-            </w:pPr>
-            <w:r>
-              <w:rPr>
-                <w:color w:val="FFFFFF"/>
-                <w:sz w:val="18"/>
-              </w:rPr>
-              <w:t>Barbeque Downs, Midrand, Johannesburg  |  076 570 0811  |  kreazoe@gmail.com</w:t>
-            </w:r>
-          </w:p>
-        </w:tc>
-      </w:tr>
-    </w:tbl>
     <w:p>
       <w:pPr>
-        <w:pStyle w:val="CVHeading"/>
-        <w:pBdr>
-          <w:bottom w:val="single" w:sz="8" w:space="3" w:color="2F6690"/>
-        </w:pBdr>
+        <w:pStyle w:val="Title"/>
+        <w:widowControl/>
       </w:pPr>
       <w:r>
-        <w:t>PROFESSIONAL PROFILE</w:t>
+        <w:t>Bheki Christopher Thobela — KREAZOE™</w:t>
       </w:r>
     </w:p>
     <w:p>
       <w:pPr>
-        <w:spacing w:after="40"/>
+        <w:widowControl/>
       </w:pPr>
       <w:r>
-        <w:t>Music producer, recording engineer, composer and artist-development professional with five years of hands-on label experience at Ambitiouz Entertainment (2017-2022), supporting established and developing artists from creative development through recording and mix preparation. Experienced in production, vocal recording, session engineering, mixing, stem preparation, song evaluation, A&amp;R-style decision-making and label discussions. Commercially released credits include work with Emtee, Sjava, Kid Tini, LaSauce, S'Villa and DJ Mkiri Way feat. Blaq Diamond. Completed Music Business and Entertainment Management at Soul Candi Institute of Music with Distinction. Combines creative instinct, technical studio ability and music-business knowledge.</w:t>
+        <w:rPr>
+          <w:sz w:val="20"/>
+        </w:rPr>
+        <w:t>Music Producer | Recording Engineer | A&amp;R &amp; Artist Development | Music Business Professional</w:t>
       </w:r>
     </w:p>
     <w:p>
       <w:pPr>
-        <w:pStyle w:val="CVHeading"/>
-        <w:pBdr>
-          <w:bottom w:val="single" w:sz="8" w:space="3" w:color="2F6690"/>
-        </w:pBdr>
+        <w:widowControl/>
       </w:pPr>
       <w:r>
-        <w:t>CORE COMPETENCIES</w:t>
+        <w:t>Johannesburg, South Africa · Open to relevant opportunities</w:t>
       </w:r>
     </w:p>
     <w:p>
       <w:pPr>
-        <w:spacing w:after="40"/>
+        <w:widowControl/>
+      </w:pPr>
+      <w:hyperlink r:id="rId9">
+        <w:r>
+          <w:rPr>
+            <w:color w:val="24465A"/>
+            <w:u w:val="single"/>
+          </w:rPr>
+          <w:t>076 570 0811</w:t>
+        </w:r>
+      </w:hyperlink>
+      <w:r>
+        <w:t xml:space="preserve"> · </w:t>
+      </w:r>
+      <w:hyperlink r:id="rId10">
+        <w:r>
+          <w:rPr>
+            <w:color w:val="24465A"/>
+            <w:u w:val="single"/>
+          </w:rPr>
+          <w:t>kreazoe@gmail.com</w:t>
+        </w:r>
+      </w:hyperlink>
+    </w:p>
+    <w:p>
+      <w:pPr>
+        <w:widowControl/>
+      </w:pPr>
+      <w:hyperlink r:id="rId12">
+        <w:r>
+          <w:rPr>
+            <w:color w:val="24465A"/>
+            <w:u w:val="single"/>
+          </w:rPr>
+          <w:t>Portfolio: kreazoe.github.io/Kreazoe/</w:t>
+        </w:r>
+      </w:hyperlink>
+    </w:p>
+    <w:p>
+      <w:pPr>
+        <w:pStyle w:val="Heading1"/>
+        <w:widowControl/>
       </w:pPr>
       <w:r>
-        <w:t>Music Production &amp; Composition  •  Recording Engineering  •  Artist Development  •  A&amp;R / Song Evaluation  •  Vocal Production  •  Arrangement  •  Mixing &amp; Stem Preparation  •  Studio Session Management  •  FL Studio  •  Logic Pro  •  DAW Adaptability  •  Studio Equipment &amp; Signal Flow  •  Music Business  •  Rights &amp; Royalties  •  Release &amp; Label Collaboration  •  Creative Direction</w:t>
+        <w:t>Professional summary</w:t>
       </w:r>
     </w:p>
     <w:p>
       <w:pPr>
-        <w:pStyle w:val="CVHeading"/>
-        <w:pBdr>
-          <w:bottom w:val="single" w:sz="8" w:space="3" w:color="2F6690"/>
-        </w:pBdr>
+        <w:widowControl/>
       </w:pPr>
       <w:r>
-        <w:t>PROFESSIONAL EXPERIENCE</w:t>
+        <w:t>Music producer and recording engineer with label experience at Ambitiouz Entertainment (2017–2022). Produced commercially released music and worked across vocal recording, editing, mixing and stem delivery for mastering. Supported artist development and contributed to A&amp;R-style song evaluation and label discussions. Completed Music Business and Entertainment Management at Soul Candi Institute of Music with Distinction.</w:t>
       </w:r>
     </w:p>
     <w:p>
       <w:pPr>
-        <w:spacing w:after="0"/>
+        <w:pStyle w:val="Heading1"/>
+        <w:widowControl/>
+      </w:pPr>
+      <w:r>
+        <w:t>Professional experience</w:t>
+      </w:r>
+    </w:p>
+    <w:p>
+      <w:pPr>
+        <w:pStyle w:val="Heading2"/>
+        <w:widowControl/>
+      </w:pPr>
+      <w:r>
+        <w:t>Ambitiouz Entertainment | 2017–2022</w:t>
+      </w:r>
+    </w:p>
+    <w:p>
+      <w:pPr>
+        <w:widowControl/>
       </w:pPr>
       <w:r>
         <w:rPr>
           <w:b/>
-          <w:color w:val="14243A"/>
-          <w:sz w:val="21"/>
         </w:rPr>
-        <w:t>AMBITIOUZ ENTERTAINMENT</w:t>
-      </w:r>
-      <w:r>
-        <w:rPr>
-          <w:b/>
-          <w:color w:val="5A6470"/>
-        </w:rPr>
-        <w:t xml:space="preserve">  |  2017 - 2022</w:t>
+        <w:t>In-House Producer · Recording Engineer · Composer · Artist Development</w:t>
       </w:r>
     </w:p>
     <w:p>
       <w:pPr>
-        <w:spacing w:after="20"/>
+        <w:pStyle w:val="ListBullet"/>
+        <w:widowControl/>
+      </w:pPr>
+      <w:r>
+        <w:t>Produced and composed commercially released music while working directly with label artists.</w:t>
+      </w:r>
+    </w:p>
+    <w:p>
+      <w:pPr>
+        <w:pStyle w:val="ListBullet"/>
+        <w:widowControl/>
+      </w:pPr>
+      <w:r>
+        <w:t>Recorded artists and engineered vocal sessions, including setup, tracking, editing and delivery of organised sessions.</w:t>
+      </w:r>
+    </w:p>
+    <w:p>
+      <w:pPr>
+        <w:pStyle w:val="ListBullet"/>
+        <w:widowControl/>
+      </w:pPr>
+      <w:r>
+        <w:t>Mixed records and prepared stems for final mastering.</w:t>
+      </w:r>
+    </w:p>
+    <w:p>
+      <w:pPr>
+        <w:pStyle w:val="ListBullet"/>
+        <w:widowControl/>
+      </w:pPr>
+      <w:r>
+        <w:t>Supported song and vocal development through arrangements, performance guidance and creative direction.</w:t>
+      </w:r>
+    </w:p>
+    <w:p>
+      <w:pPr>
+        <w:pStyle w:val="ListBullet"/>
+        <w:widowControl/>
+      </w:pPr>
+      <w:r>
+        <w:t>Contributed to A&amp;R-style song evaluation and discussions about release or commercial potential.</w:t>
+      </w:r>
+    </w:p>
+    <w:p>
+      <w:pPr>
+        <w:pStyle w:val="ListBullet"/>
+        <w:widowControl/>
+      </w:pPr>
+      <w:r>
+        <w:t>Participated in label, artist, release and music-business discussions with artists and creative teams.</w:t>
+      </w:r>
+    </w:p>
+    <w:p>
+      <w:pPr>
+        <w:pStyle w:val="Heading2"/>
+        <w:widowControl/>
+      </w:pPr>
+      <w:r>
+        <w:t>Kreazoe International / Independent creative work</w:t>
+      </w:r>
+    </w:p>
+    <w:p>
+      <w:pPr>
+        <w:widowControl/>
       </w:pPr>
       <w:r>
         <w:rPr>
           <w:b/>
-          <w:color w:val="2F6690"/>
         </w:rPr>
-        <w:t>In-House Producer • Recording Engineer • Composer • Artist Development</w:t>
+        <w:t>Music Producer · Composer · Creative / Graphic Designer</w:t>
       </w:r>
     </w:p>
     <w:p>
       <w:pPr>
-        <w:spacing w:after="24"/>
-        <w:ind w:left="230" w:hanging="158"/>
+        <w:widowControl/>
       </w:pPr>
       <w:r>
-        <w:rPr>
-          <w:color w:val="2F6690"/>
-        </w:rPr>
-        <w:t xml:space="preserve">• </w:t>
-      </w:r>
-      <w:r>
-        <w:t>Produced and composed commercially released records while working directly with label artists in studio.</w:t>
+        <w:t>Independent work before and after Ambitiouz Entertainment.</w:t>
       </w:r>
     </w:p>
     <w:p>
       <w:pPr>
-        <w:spacing w:after="24"/>
-        <w:ind w:left="230" w:hanging="158"/>
+        <w:pStyle w:val="ListBullet"/>
+        <w:widowControl/>
       </w:pPr>
       <w:r>
-        <w:rPr>
-          <w:color w:val="2F6690"/>
-        </w:rPr>
-        <w:t xml:space="preserve">• </w:t>
-      </w:r>
-      <w:r>
-        <w:t>Recorded artists and engineered vocal sessions, including session setup, tracking, editing and delivery of clean production sessions.</w:t>
+        <w:t>Produced independent records and supported artists with music creation and creative development.</w:t>
       </w:r>
     </w:p>
     <w:p>
       <w:pPr>
-        <w:spacing w:after="24"/>
-        <w:ind w:left="230" w:hanging="158"/>
+        <w:pStyle w:val="ListBullet"/>
+        <w:widowControl/>
       </w:pPr>
       <w:r>
-        <w:rPr>
-          <w:color w:val="2F6690"/>
-        </w:rPr>
-        <w:t xml:space="preserve">• </w:t>
-      </w:r>
-      <w:r>
-        <w:t>Mixed records and prepared organised stems for final mastering.</w:t>
+        <w:t>Created artist graphics and album artwork, including design work for Harrison Crump’s Legendary project.</w:t>
       </w:r>
     </w:p>
     <w:p>
       <w:pPr>
-        <w:spacing w:after="24"/>
-        <w:ind w:left="230" w:hanging="158"/>
+        <w:pStyle w:val="ListBullet"/>
+        <w:widowControl/>
       </w:pPr>
       <w:r>
-        <w:rPr>
-          <w:color w:val="2F6690"/>
-        </w:rPr>
-        <w:t xml:space="preserve">• </w:t>
-      </w:r>
-      <w:r>
-        <w:t>Supported artist development by helping shape songs, performances, arrangements, vocal delivery and overall creative direction.</w:t>
+        <w:t>Continued independent production after Ambitiouz Entertainment, including Inkabi Zezwe’s Iskhwele (first-hand studio history).</w:t>
       </w:r>
     </w:p>
     <w:p>
       <w:pPr>
-        <w:spacing w:after="24"/>
-        <w:ind w:left="230" w:hanging="158"/>
+        <w:pStyle w:val="Heading1"/>
+        <w:widowControl/>
       </w:pPr>
       <w:r>
-        <w:rPr>
-          <w:color w:val="2F6690"/>
-        </w:rPr>
-        <w:t xml:space="preserve">• </w:t>
-      </w:r>
-      <w:r>
-        <w:t>Contributed to A&amp;R-style song evaluation and decisions on which records showed release or commercial potential.</w:t>
+        <w:t>Education and training</w:t>
       </w:r>
     </w:p>
     <w:p>
       <w:pPr>
-        <w:spacing w:after="24"/>
-        <w:ind w:left="230" w:hanging="158"/>
+        <w:widowControl/>
       </w:pPr>
       <w:r>
         <w:rPr>
-          <w:color w:val="2F6690"/>
+          <w:b/>
         </w:rPr>
-        <w:t xml:space="preserve">• </w:t>
-      </w:r>
-      <w:r>
-        <w:t>Participated in label, artist, release and music-business discussions and collaborated with artists and creative teams.</w:t>
+        <w:t>Soul Candi Institute of Music</w:t>
       </w:r>
     </w:p>
     <w:p>
       <w:pPr>
-        <w:spacing w:after="24"/>
-        <w:ind w:left="230" w:hanging="158"/>
+        <w:widowControl/>
       </w:pPr>
       <w:r>
-        <w:rPr>
-          <w:color w:val="2F6690"/>
-        </w:rPr>
-        <w:t xml:space="preserve">• </w:t>
-      </w:r>
-      <w:r>
-        <w:t>Production, recording and artist-development work included Emtee's DIY 2 era; Kid Tini's The Second Coming; LaSauce's Sindisiwe; Sjava's 'Isibhamu'; S'Villa; Saudi; DJ Mkiri Way feat. Blaq Diamond; and recording work on CiCi's Busisiwe project.</w:t>
+        <w:t>Music Business &amp; Entertainment Management — Distinction. Qualification quality-assured by SAMRO.</w:t>
       </w:r>
     </w:p>
     <w:p>
       <w:pPr>
-        <w:spacing w:before="40" w:after="0"/>
+        <w:widowControl/>
+      </w:pPr>
+      <w:r>
+        <w:t>Skills Academy | Introduction to Personal Computers | 17 October 2023</w:t>
+      </w:r>
+    </w:p>
+    <w:p>
+      <w:pPr>
+        <w:widowControl/>
+      </w:pPr>
+      <w:r>
+        <w:t>Idlangemabala Secondary School | National Senior Certificate (Matric)</w:t>
+      </w:r>
+    </w:p>
+    <w:p>
+      <w:r>
+        <w:br w:type="page"/>
+      </w:r>
+    </w:p>
+    <w:p>
+      <w:pPr>
+        <w:pStyle w:val="Heading1"/>
+        <w:widowControl/>
+      </w:pPr>
+      <w:r>
+        <w:t>SELECTED PRODUCTION &amp; MUSIC CREDITS</w:t>
+      </w:r>
+    </w:p>
+    <w:p>
+      <w:pPr>
+        <w:keepNext/>
+        <w:widowControl/>
+        <w:spacing w:before="80" w:after="20"/>
+      </w:pPr>
+      <w:hyperlink r:id="rId13">
+        <w:r>
+          <w:rPr>
+            <w:color w:val="24465A"/>
+            <w:u w:val="single"/>
+            <w:b/>
+          </w:rPr>
+          <w:t>Emtee feat. S’Villa &amp; Snymaan — Abantu (DIY 2, 2018)</w:t>
+        </w:r>
+      </w:hyperlink>
+    </w:p>
+    <w:p>
+      <w:pPr>
+        <w:widowControl/>
+        <w:spacing w:after="60"/>
+      </w:pPr>
+      <w:r>
+        <w:t>Producer · Studio Producer · Non-Lyric Author | Recording¹</w:t>
+      </w:r>
+    </w:p>
+    <w:p>
+      <w:pPr>
+        <w:keepNext/>
+        <w:widowControl/>
+        <w:spacing w:before="80" w:after="20"/>
+      </w:pPr>
+      <w:hyperlink r:id="rId13">
+        <w:r>
+          <w:rPr>
+            <w:color w:val="24465A"/>
+            <w:u w:val="single"/>
+            <w:b/>
+          </w:rPr>
+          <w:t>Emtee — Lessons (DIY 2, 2018)</w:t>
+        </w:r>
+      </w:hyperlink>
+    </w:p>
+    <w:p>
+      <w:pPr>
+        <w:widowControl/>
+        <w:spacing w:after="60"/>
+      </w:pPr>
+      <w:r>
+        <w:t>Producer · Studio Producer · Non-Lyric Author | Recording¹</w:t>
+      </w:r>
+    </w:p>
+    <w:p>
+      <w:pPr>
+        <w:keepNext/>
+        <w:widowControl/>
+        <w:spacing w:before="80" w:after="20"/>
+      </w:pPr>
+      <w:hyperlink r:id="rId14">
+        <w:r>
+          <w:rPr>
+            <w:color w:val="24465A"/>
+            <w:u w:val="single"/>
+            <w:b/>
+          </w:rPr>
+          <w:t>Sjava — Isibhamu (Umqhele, 2018)</w:t>
+        </w:r>
+      </w:hyperlink>
+    </w:p>
+    <w:p>
+      <w:pPr>
+        <w:widowControl/>
+        <w:spacing w:after="60"/>
+      </w:pPr>
+      <w:r>
+        <w:t>Co-Producer with Mfanafuthi Ruff Nkosi | Recording¹</w:t>
+      </w:r>
+    </w:p>
+    <w:p>
+      <w:pPr>
+        <w:keepNext/>
+        <w:widowControl/>
+        <w:spacing w:before="80" w:after="20"/>
+      </w:pPr>
+      <w:hyperlink r:id="rId15">
+        <w:r>
+          <w:rPr>
+            <w:color w:val="24465A"/>
+            <w:u w:val="single"/>
+            <w:b/>
+          </w:rPr>
+          <w:t>LaSauce feat. Lisa — Messed Up (Broken Lipstick, 2017)</w:t>
+        </w:r>
+      </w:hyperlink>
+    </w:p>
+    <w:p>
+      <w:pPr>
+        <w:widowControl/>
+        <w:spacing w:after="60"/>
+      </w:pPr>
+      <w:r>
+        <w:t>Producer · Studio Producer · Non-Lyric Author</w:t>
+      </w:r>
+    </w:p>
+    <w:p>
+      <w:pPr>
+        <w:keepNext/>
+        <w:widowControl/>
+        <w:spacing w:before="80" w:after="20"/>
+      </w:pPr>
+      <w:hyperlink r:id="rId16">
+        <w:r>
+          <w:rPr>
+            <w:color w:val="24465A"/>
+            <w:u w:val="single"/>
+            <w:b/>
+          </w:rPr>
+          <w:t>Kid Tini — Bet (Sound Mind, 2019)</w:t>
+        </w:r>
+      </w:hyperlink>
+    </w:p>
+    <w:p>
+      <w:pPr>
+        <w:widowControl/>
+        <w:spacing w:after="60"/>
+      </w:pPr>
+      <w:r>
+        <w:t>Producer</w:t>
+      </w:r>
+    </w:p>
+    <w:p>
+      <w:pPr>
+        <w:keepNext/>
+        <w:widowControl/>
+        <w:spacing w:before="80" w:after="20"/>
+      </w:pPr>
+      <w:hyperlink r:id="rId17">
+        <w:r>
+          <w:rPr>
+            <w:color w:val="24465A"/>
+            <w:u w:val="single"/>
+            <w:b/>
+          </w:rPr>
+          <w:t>Kid Tini — My People (The Second Coming, 2020)</w:t>
+        </w:r>
+      </w:hyperlink>
+    </w:p>
+    <w:p>
+      <w:pPr>
+        <w:widowControl/>
+        <w:spacing w:after="60"/>
+      </w:pPr>
+      <w:r>
+        <w:t>Producer | Recording¹</w:t>
+      </w:r>
+    </w:p>
+    <w:p>
+      <w:pPr>
+        <w:keepNext/>
+        <w:widowControl/>
+        <w:spacing w:before="80" w:after="20"/>
+      </w:pPr>
+      <w:hyperlink r:id="rId18">
+        <w:r>
+          <w:rPr>
+            <w:color w:val="24465A"/>
+            <w:u w:val="single"/>
+            <w:b/>
+          </w:rPr>
+          <w:t>Kid Tini — Icebo (The Second Coming, 2020)</w:t>
+        </w:r>
+      </w:hyperlink>
+    </w:p>
+    <w:p>
+      <w:pPr>
+        <w:widowControl/>
+        <w:spacing w:after="60"/>
+      </w:pPr>
+      <w:r>
+        <w:t>Co-Producer with Pheto Mbulelo Mabena | Recording¹</w:t>
+      </w:r>
+    </w:p>
+    <w:p>
+      <w:pPr>
+        <w:keepNext/>
+        <w:widowControl/>
+        <w:spacing w:before="80" w:after="20"/>
+      </w:pPr>
+      <w:hyperlink r:id="rId19">
+        <w:r>
+          <w:rPr>
+            <w:color w:val="24465A"/>
+            <w:u w:val="single"/>
+            <w:b/>
+          </w:rPr>
+          <w:t>Kid Tini feat. Sbahle — Amen (The Second Coming, 2020)</w:t>
+        </w:r>
+      </w:hyperlink>
+    </w:p>
+    <w:p>
+      <w:pPr>
+        <w:widowControl/>
+        <w:spacing w:after="60"/>
+      </w:pPr>
+      <w:r>
+        <w:t>Composer · Producer, alongside Philangezwi Sithethelelwe Makhathini and Tumelo Thandokuhle Mathebula | Recording¹</w:t>
+      </w:r>
+    </w:p>
+    <w:p>
+      <w:pPr>
+        <w:keepNext/>
+        <w:widowControl/>
+        <w:spacing w:before="80" w:after="20"/>
+      </w:pPr>
+      <w:hyperlink r:id="rId20">
+        <w:r>
+          <w:rPr>
+            <w:color w:val="24465A"/>
+            <w:u w:val="single"/>
+            <w:b/>
+          </w:rPr>
+          <w:t>Saudi — Please Understand (The Drip’s Leak, 2020)</w:t>
+        </w:r>
+      </w:hyperlink>
+    </w:p>
+    <w:p>
+      <w:pPr>
+        <w:widowControl/>
+        <w:spacing w:after="60"/>
+      </w:pPr>
+      <w:r>
+        <w:t>Producer, credited as Kreazoe</w:t>
+      </w:r>
+    </w:p>
+    <w:p>
+      <w:pPr>
+        <w:keepNext/>
+        <w:widowControl/>
+        <w:spacing w:before="80" w:after="20"/>
+      </w:pPr>
+      <w:hyperlink r:id="rId21">
+        <w:r>
+          <w:rPr>
+            <w:color w:val="24465A"/>
+            <w:u w:val="single"/>
+            <w:b/>
+          </w:rPr>
+          <w:t>DJ Mkiri Way feat. Blaq Diamond — On My Mama (2019)</w:t>
+        </w:r>
+      </w:hyperlink>
+    </w:p>
+    <w:p>
+      <w:pPr>
+        <w:widowControl/>
+        <w:spacing w:after="60"/>
+      </w:pPr>
+      <w:r>
+        <w:t>Producer, credited as Bheki Christopher Thobela</w:t>
+      </w:r>
+    </w:p>
+    <w:p>
+      <w:pPr>
+        <w:widowControl/>
+        <w:spacing w:before="100" w:after="100"/>
+      </w:pPr>
+      <w:r>
+        <w:rPr>
+          <w:sz w:val="19"/>
+        </w:rPr>
+        <w:t>Evidence: Linked public metadata supports the production/composition roles shown. ¹ Recording denotes documented first-hand studio history, not independently verified recording/engineering credits. Producer does not imply sole production.</w:t>
+      </w:r>
+    </w:p>
+    <w:p>
+      <w:pPr>
+        <w:pStyle w:val="Heading1"/>
+        <w:widowControl/>
+      </w:pPr>
+      <w:r>
+        <w:t>Professional capabilities</w:t>
+      </w:r>
+    </w:p>
+    <w:p>
+      <w:pPr>
+        <w:widowControl/>
       </w:pPr>
       <w:r>
         <w:rPr>
           <w:b/>
-          <w:color w:val="14243A"/>
-          <w:sz w:val="21"/>
         </w:rPr>
-        <w:t>KREAZOE INTERNATIONAL / INDEPENDENT CREATIVE WORK</w:t>
+        <w:t xml:space="preserve">Music production: </w:t>
+      </w:r>
+      <w:r>
+        <w:t>Composition · Beat creation · Arrangement · Sound selection · Creative direction.</w:t>
       </w:r>
     </w:p>
     <w:p>
       <w:pPr>
-        <w:spacing w:after="20"/>
+        <w:widowControl/>
       </w:pPr>
       <w:r>
         <w:rPr>
           <w:b/>
-          <w:color w:val="2F6690"/>
         </w:rPr>
-        <w:t>Music Producer • Composer • Creative / Graphic Designer</w:t>
+        <w:t xml:space="preserve">Recording and studio: </w:t>
+      </w:r>
+      <w:r>
+        <w:t>Vocal recording/production · Session setup · Editing · Mixing · Stem preparation.</w:t>
       </w:r>
     </w:p>
     <w:p>
       <w:pPr>
-        <w:spacing w:after="24"/>
-        <w:ind w:left="230" w:hanging="158"/>
+        <w:widowControl/>
       </w:pPr>
       <w:r>
         <w:rPr>
-          <w:color w:val="2F6690"/>
+          <w:b/>
         </w:rPr>
-        <w:t xml:space="preserve">• </w:t>
+        <w:t xml:space="preserve">Artist development and A&amp;R-style experience: </w:t>
       </w:r>
       <w:r>
-        <w:t>Produced independent records and worked with artists on music creation and creative development before joining Ambitiouz Entertainment.</w:t>
+        <w:t>Song evaluation · Performance guidance · Creative/release discussions.</w:t>
       </w:r>
     </w:p>
     <w:p>
       <w:pPr>
-        <w:spacing w:after="24"/>
-        <w:ind w:left="230" w:hanging="158"/>
+        <w:widowControl/>
       </w:pPr>
       <w:r>
         <w:rPr>
-          <w:color w:val="2F6690"/>
+          <w:b/>
         </w:rPr>
-        <w:t xml:space="preserve">• </w:t>
+        <w:t xml:space="preserve">Music business: </w:t>
       </w:r>
       <w:r>
-        <w:t>Created artist graphics and music artwork, including design work for Harrison Crump's Legendary album project.</w:t>
+        <w:t>Music-business education · Label, artist and release discussions.</w:t>
       </w:r>
     </w:p>
     <w:p>
       <w:pPr>
-        <w:spacing w:after="24"/>
-        <w:ind w:left="230" w:hanging="158"/>
+        <w:widowControl/>
       </w:pPr>
       <w:r>
         <w:rPr>
-          <w:color w:val="2F6690"/>
+          <w:b/>
         </w:rPr>
-        <w:t xml:space="preserve">• </w:t>
+        <w:t xml:space="preserve">DAWs and technical: </w:t>
       </w:r>
       <w:r>
-        <w:t>Continued independent production after Ambitiouz Entertainment, including production work on Inkabi Zezwe's 'Iskhwele'.</w:t>
+        <w:t>FL Studio · Logic Pro · MIDI · Routing · Signal flow · Studio equipment.</w:t>
       </w:r>
     </w:p>
     <w:p>
       <w:pPr>
-        <w:pStyle w:val="CVHeading"/>
-        <w:pBdr>
-          <w:bottom w:val="single" w:sz="8" w:space="3" w:color="2F6690"/>
-        </w:pBdr>
+        <w:pStyle w:val="Heading1"/>
+        <w:widowControl/>
       </w:pPr>
       <w:r>
-        <w:t>SELECTED COMMERCIAL MUSIC CREDITS</w:t>
+        <w:t>Career direction and availability</w:t>
       </w:r>
     </w:p>
     <w:p>
       <w:pPr>
-        <w:spacing w:after="20"/>
-        <w:ind w:left="173" w:hanging="115"/>
+        <w:widowControl/>
       </w:pPr>
       <w:r>
-        <w:rPr>
-          <w:color w:val="2F6690"/>
-        </w:rPr>
-        <w:t xml:space="preserve">• </w:t>
-      </w:r>
-      <w:r>
-        <w:rPr>
-          <w:b/>
-        </w:rPr>
-        <w:t xml:space="preserve">Emtee - DIY 2: </w:t>
-      </w:r>
-      <w:r>
-        <w:t>Producer &amp; Recording Engineer: 'Lessons', 'Abantu', 'Bring It Back' and 'I Need Love'.</w:t>
+        <w:t>Target roles: Music production · Recording/studio engineering · A&amp;R support · Artist development · Music business/operations · Artist/label relations. Additional career interests: Rights/repertoire and release/distribution support.</w:t>
       </w:r>
     </w:p>
     <w:p>
       <w:pPr>
-        <w:spacing w:after="20"/>
-        <w:ind w:left="173" w:hanging="115"/>
+        <w:widowControl/>
       </w:pPr>
-      <w:r>
-        <w:rPr>
-          <w:color w:val="2F6690"/>
-        </w:rPr>
-        <w:t xml:space="preserve">• </w:t>
-      </w:r>
-      <w:r>
-        <w:rPr>
-          <w:b/>
-        </w:rPr>
-        <w:t xml:space="preserve">Emtee - additional records: </w:t>
-      </w:r>
-      <w:r>
-        <w:t>Producer &amp; Recording Engineer: 'Prayer' and 'Smogolo'.</w:t>
-      </w:r>
-    </w:p>
-    <w:p>
-      <w:pPr>
-        <w:spacing w:after="20"/>
-        <w:ind w:left="173" w:hanging="115"/>
-      </w:pPr>
-      <w:r>
-        <w:rPr>
-          <w:color w:val="2F6690"/>
-        </w:rPr>
-        <w:t xml:space="preserve">• </w:t>
-      </w:r>
-      <w:r>
-        <w:rPr>
-          <w:b/>
-        </w:rPr>
-        <w:t xml:space="preserve">Kid Tini - The Second Coming: </w:t>
-      </w:r>
-      <w:r>
-        <w:t>Produced beats and recorded: 'Winning', 'Andisababoni', 'Icebo', 'My People', 'Amen', 'Lollipop', 'Sucker Free' and 'Life'.</w:t>
-      </w:r>
-    </w:p>
-    <w:p>
-      <w:pPr>
-        <w:spacing w:after="20"/>
-        <w:ind w:left="173" w:hanging="115"/>
-      </w:pPr>
-      <w:r>
-        <w:rPr>
-          <w:color w:val="2F6690"/>
-        </w:rPr>
-        <w:t xml:space="preserve">• </w:t>
-      </w:r>
-      <w:r>
-        <w:rPr>
-          <w:b/>
-        </w:rPr>
-        <w:t xml:space="preserve">Kid Tini - additional records: </w:t>
-      </w:r>
-      <w:r>
-        <w:t>Produced beats and recorded: 'Right Back', 'Movie' and 'Get Money' feat. Styles P &amp; Stogie T.</w:t>
-      </w:r>
-    </w:p>
-    <w:p>
-      <w:pPr>
-        <w:spacing w:after="20"/>
-        <w:ind w:left="173" w:hanging="115"/>
-      </w:pPr>
-      <w:r>
-        <w:rPr>
-          <w:color w:val="2F6690"/>
-        </w:rPr>
-        <w:t xml:space="preserve">• </w:t>
-      </w:r>
-      <w:r>
-        <w:rPr>
-          <w:b/>
-        </w:rPr>
-        <w:t xml:space="preserve">LaSauce - Sindisiwe: </w:t>
-      </w:r>
-      <w:r>
-        <w:t>Producer &amp; Recording Engineer: 'Umona', 'Questions', 'Every Morning', 'Is It True' and 'Phinde'.</w:t>
-      </w:r>
-    </w:p>
-    <w:p>
-      <w:pPr>
-        <w:spacing w:after="20"/>
-        <w:ind w:left="173" w:hanging="115"/>
-      </w:pPr>
-      <w:r>
-        <w:rPr>
-          <w:color w:val="2F6690"/>
-        </w:rPr>
-        <w:t xml:space="preserve">• </w:t>
-      </w:r>
-      <w:r>
-        <w:rPr>
-          <w:b/>
-        </w:rPr>
-        <w:t xml:space="preserve">Sjava - 'Isibhamu': </w:t>
-      </w:r>
-      <w:r>
-        <w:t>Producer &amp; Recording Engineer / studio involvement.</w:t>
-      </w:r>
-    </w:p>
-    <w:p>
-      <w:pPr>
-        <w:spacing w:after="20"/>
-        <w:ind w:left="173" w:hanging="115"/>
-      </w:pPr>
-      <w:r>
-        <w:rPr>
-          <w:color w:val="2F6690"/>
-        </w:rPr>
-        <w:t xml:space="preserve">• </w:t>
-      </w:r>
-      <w:r>
-        <w:rPr>
-          <w:b/>
-        </w:rPr>
-        <w:t xml:space="preserve">S'Villa - 'Thula': </w:t>
-      </w:r>
-      <w:r>
-        <w:t>Producer / studio involvement.</w:t>
-      </w:r>
-    </w:p>
-    <w:p>
-      <w:pPr>
-        <w:spacing w:after="20"/>
-        <w:ind w:left="173" w:hanging="115"/>
-      </w:pPr>
-      <w:r>
-        <w:rPr>
-          <w:color w:val="2F6690"/>
-        </w:rPr>
-        <w:t xml:space="preserve">• </w:t>
-      </w:r>
-      <w:r>
-        <w:rPr>
-          <w:b/>
-        </w:rPr>
-        <w:t xml:space="preserve">DJ Mkiri Way feat. Blaq Diamond - 'On My Mama': </w:t>
-      </w:r>
-      <w:r>
-        <w:t>Producer / studio involvement.</w:t>
-      </w:r>
-    </w:p>
-    <w:p>
-      <w:pPr>
-        <w:spacing w:after="20"/>
-        <w:ind w:left="173" w:hanging="115"/>
-      </w:pPr>
-      <w:r>
-        <w:rPr>
-          <w:color w:val="2F6690"/>
-        </w:rPr>
-        <w:t xml:space="preserve">• </w:t>
-      </w:r>
-      <w:r>
-        <w:rPr>
-          <w:b/>
-        </w:rPr>
-        <w:t xml:space="preserve">CiCi - Busisiwe: </w:t>
-      </w:r>
-      <w:r>
-        <w:t>Recorded most of the project; no production claim.</w:t>
-      </w:r>
-    </w:p>
-    <w:p>
-      <w:pPr>
-        <w:pStyle w:val="CVHeading"/>
-        <w:pBdr>
-          <w:bottom w:val="single" w:sz="8" w:space="3" w:color="2F6690"/>
-        </w:pBdr>
-      </w:pPr>
-      <w:r>
-        <w:t>EDUCATION &amp; TRAINING</w:t>
-      </w:r>
-    </w:p>
-    <w:p>
-      <w:r>
-        <w:rPr>
-          <w:b/>
-          <w:color w:val="14243A"/>
-        </w:rPr>
-        <w:t>Soul Candi Institute of Music</w:t>
-      </w:r>
-      <w:r>
-        <w:t xml:space="preserve">  |  Music Business and Entertainment Management</w:t>
-      </w:r>
-    </w:p>
-    <w:p>
-      <w:pPr>
-        <w:ind w:left="173"/>
-      </w:pPr>
-      <w:r>
-        <w:rPr>
-          <w:b/>
-          <w:color w:val="2F6690"/>
-        </w:rPr>
-        <w:t>Completed with Distinction</w:t>
-      </w:r>
-      <w:r>
-        <w:t xml:space="preserve">  •  Qualification quality-assured by SAMRO</w:t>
-      </w:r>
-    </w:p>
-    <w:p>
-      <w:r>
-        <w:rPr>
-          <w:b/>
-          <w:color w:val="14243A"/>
-        </w:rPr>
-        <w:t>Skills Academy</w:t>
-      </w:r>
-      <w:r>
-        <w:t xml:space="preserve">  |  Introduction to Personal Computers  |  17 October 2023</w:t>
-      </w:r>
-    </w:p>
-    <w:p>
-      <w:pPr>
-        <w:ind w:left="173"/>
-      </w:pPr>
-      <w:r>
-        <w:t>Foundational personal-computer training and digital workplace skills.</w:t>
-      </w:r>
-    </w:p>
-    <w:p>
-      <w:r>
-        <w:rPr>
-          <w:b/>
-          <w:color w:val="14243A"/>
-        </w:rPr>
-        <w:t>Idlangemabala Secondary School</w:t>
-      </w:r>
-      <w:r>
-        <w:t xml:space="preserve">  |  National Senior Certificate (Matric)</w:t>
-      </w:r>
-    </w:p>
-    <w:p>
-      <w:pPr>
-        <w:pStyle w:val="CVHeading"/>
-        <w:pBdr>
-          <w:bottom w:val="single" w:sz="8" w:space="3" w:color="2F6690"/>
-        </w:pBdr>
-      </w:pPr>
-      <w:r>
-        <w:t>TECHNICAL &amp; STUDIO SKILLS</w:t>
-      </w:r>
-    </w:p>
-    <w:p>
-      <w:pPr>
-        <w:spacing w:after="24"/>
-        <w:ind w:left="230" w:hanging="158"/>
-      </w:pPr>
-      <w:r>
-        <w:rPr>
-          <w:color w:val="2F6690"/>
-        </w:rPr>
-        <w:t xml:space="preserve">• </w:t>
-      </w:r>
-      <w:r>
-        <w:t>DAWs: FL Studio and Logic Pro; comfortable learning and operating other professional DAWs.</w:t>
-      </w:r>
-    </w:p>
-    <w:p>
-      <w:pPr>
-        <w:spacing w:after="24"/>
-        <w:ind w:left="230" w:hanging="158"/>
-      </w:pPr>
-      <w:r>
-        <w:rPr>
-          <w:color w:val="2F6690"/>
-        </w:rPr>
-        <w:t xml:space="preserve">• </w:t>
-      </w:r>
-      <w:r>
-        <w:t>Studio: vocal recording, session setup, microphone and interface operation, signal flow, MIDI, routing and common studio equipment.</w:t>
-      </w:r>
-    </w:p>
-    <w:p>
-      <w:pPr>
-        <w:spacing w:after="24"/>
-        <w:ind w:left="230" w:hanging="158"/>
-      </w:pPr>
-      <w:r>
-        <w:rPr>
-          <w:color w:val="2F6690"/>
-        </w:rPr>
-        <w:t xml:space="preserve">• </w:t>
-      </w:r>
-      <w:r>
-        <w:t>Production: beat creation, composition, arrangement, sound selection, vocal production, editing and creative direction.</w:t>
-      </w:r>
-    </w:p>
-    <w:p>
-      <w:pPr>
-        <w:spacing w:after="24"/>
-        <w:ind w:left="230" w:hanging="158"/>
-      </w:pPr>
-      <w:r>
-        <w:rPr>
-          <w:color w:val="2F6690"/>
-        </w:rPr>
-        <w:t xml:space="preserve">• </w:t>
-      </w:r>
-      <w:r>
-        <w:t>Post-production: mixing, session cleanup, export management and preparation of stems for mastering.</w:t>
-      </w:r>
-    </w:p>
-    <w:p>
-      <w:pPr>
-        <w:spacing w:after="24"/>
-        <w:ind w:left="230" w:hanging="158"/>
-      </w:pPr>
-      <w:r>
-        <w:rPr>
-          <w:color w:val="2F6690"/>
-        </w:rPr>
-        <w:t xml:space="preserve">• </w:t>
-      </w:r>
-      <w:r>
-        <w:t>Creative: graphic design and album/artist artwork experience.</w:t>
-      </w:r>
-    </w:p>
-    <w:p>
-      <w:pPr>
-        <w:pStyle w:val="CVHeading"/>
-        <w:pBdr>
-          <w:bottom w:val="single" w:sz="8" w:space="3" w:color="2F6690"/>
-        </w:pBdr>
-      </w:pPr>
-      <w:r>
-        <w:t>MUSIC BUSINESS &amp; A&amp;R CAPABILITIES</w:t>
-      </w:r>
-    </w:p>
-    <w:p>
-      <w:pPr>
-        <w:spacing w:after="24"/>
-        <w:ind w:left="230" w:hanging="158"/>
-      </w:pPr>
-      <w:r>
-        <w:rPr>
-          <w:color w:val="2F6690"/>
-        </w:rPr>
-        <w:t xml:space="preserve">• </w:t>
-      </w:r>
-      <w:r>
-        <w:t>Artist development and creative guidance during recording and production.</w:t>
-      </w:r>
-    </w:p>
-    <w:p>
-      <w:pPr>
-        <w:spacing w:after="24"/>
-        <w:ind w:left="230" w:hanging="158"/>
-      </w:pPr>
-      <w:r>
-        <w:rPr>
-          <w:color w:val="2F6690"/>
-        </w:rPr>
-        <w:t xml:space="preserve">• </w:t>
-      </w:r>
-      <w:r>
-        <w:t>Song evaluation, identifying record potential and contributing to creative/release decisions.</w:t>
-      </w:r>
-    </w:p>
-    <w:p>
-      <w:pPr>
-        <w:spacing w:after="24"/>
-        <w:ind w:left="230" w:hanging="158"/>
-      </w:pPr>
-      <w:r>
-        <w:rPr>
-          <w:color w:val="2F6690"/>
-        </w:rPr>
-        <w:t xml:space="preserve">• </w:t>
-      </w:r>
-      <w:r>
-        <w:t>Practical understanding of music rights, royalties, repertoire administration and the South African music ecosystem.</w:t>
-      </w:r>
-    </w:p>
-    <w:p>
-      <w:pPr>
-        <w:spacing w:after="24"/>
-        <w:ind w:left="230" w:hanging="158"/>
-      </w:pPr>
-      <w:r>
-        <w:rPr>
-          <w:color w:val="2F6690"/>
-        </w:rPr>
-        <w:t xml:space="preserve">• </w:t>
-      </w:r>
-      <w:r>
-        <w:t>Experience contributing to label discussions, release planning and artist/project conversations.</w:t>
-      </w:r>
-    </w:p>
-    <w:p>
-      <w:pPr>
-        <w:spacing w:after="24"/>
-        <w:ind w:left="230" w:hanging="158"/>
-      </w:pPr>
-      <w:r>
-        <w:rPr>
-          <w:color w:val="2F6690"/>
-        </w:rPr>
-        <w:t xml:space="preserve">• </w:t>
-      </w:r>
-      <w:r>
-        <w:t>Able to bridge artist needs, studio execution and music-business objectives.</w:t>
-      </w:r>
-    </w:p>
-    <w:p>
-      <w:pPr>
-        <w:pStyle w:val="CVHeading"/>
-        <w:pBdr>
-          <w:bottom w:val="single" w:sz="8" w:space="3" w:color="2F6690"/>
-        </w:pBdr>
-      </w:pPr>
-      <w:r>
-        <w:t>LANGUAGES</w:t>
-      </w:r>
-    </w:p>
-    <w:p>
-      <w:r>
-        <w:t>English  •  isiZulu  •  siSwati</w:t>
-      </w:r>
-    </w:p>
-    <w:p>
-      <w:pPr>
-        <w:pStyle w:val="CVHeading"/>
-        <w:pBdr>
-          <w:bottom w:val="single" w:sz="8" w:space="3" w:color="2F6690"/>
-        </w:pBdr>
-      </w:pPr>
-      <w:r>
-        <w:t>ADDITIONAL INFORMATION</w:t>
-      </w:r>
-    </w:p>
-    <w:p>
-      <w:pPr>
-        <w:spacing w:after="24"/>
-        <w:ind w:left="230" w:hanging="158"/>
-      </w:pPr>
-      <w:r>
-        <w:rPr>
-          <w:color w:val="2F6690"/>
-        </w:rPr>
-        <w:t xml:space="preserve">• </w:t>
-      </w:r>
-      <w:r>
-        <w:t>Based in Barbeque Downs, Midrand, Johannesburg, Gauteng.</w:t>
-      </w:r>
-    </w:p>
-    <w:p>
-      <w:pPr>
-        <w:spacing w:after="24"/>
-        <w:ind w:left="230" w:hanging="158"/>
-      </w:pPr>
-      <w:r>
-        <w:rPr>
-          <w:color w:val="2F6690"/>
-        </w:rPr>
-        <w:t xml:space="preserve">• </w:t>
-      </w:r>
       <w:r>
         <w:t>Open to full-time, hybrid, remote and contract opportunities.</w:t>
       </w:r>
     </w:p>
     <w:p>
       <w:pPr>
-        <w:spacing w:after="24"/>
-        <w:ind w:left="230" w:hanging="158"/>
+        <w:widowControl/>
       </w:pPr>
       <w:r>
         <w:rPr>
-          <w:color w:val="2F6690"/>
+          <w:b/>
         </w:rPr>
-        <w:t xml:space="preserve">• </w:t>
-      </w:r>
-      <w:r>
-        <w:t>Available for A&amp;R, artist development, label/artist relations, studio, production, recording, music operations, rights/royalties and related entertainment roles.</w:t>
-      </w:r>
-    </w:p>
-    <w:p>
-      <w:pPr>
-        <w:spacing w:after="24"/>
-        <w:ind w:left="230" w:hanging="158"/>
-      </w:pPr>
-      <w:r>
-        <w:rPr>
-          <w:color w:val="2F6690"/>
-        </w:rPr>
-        <w:t xml:space="preserve">• </w:t>
-      </w:r>
-      <w:r>
-        <w:t>Professional references available on request.</w:t>
-      </w:r>
-    </w:p>
-    <w:p>
-      <w:pPr>
-        <w:pStyle w:val="CVHeading"/>
-        <w:pBdr>
-          <w:bottom w:val="single" w:sz="8" w:space="3" w:color="2F6690"/>
-        </w:pBdr>
-      </w:pPr>
-      <w:r>
-        <w:t>SELECTED PUBLIC CREDIT VERIFICATION</w:t>
-      </w:r>
-    </w:p>
-    <w:p>
-      <w:pPr>
-        <w:spacing w:after="20"/>
-      </w:pPr>
-      <w:r>
-        <w:t>Selected credits are publicly documented by major music metadata/catalogue services, including production credits for Emtee's DIY 2, Sjava's 'Isibhamu', Kid Tini, LaSauce, S'Villa and DJ Mkiri Way feat. Blaq Diamond. Full discography / portfolio links available on request.</w:t>
+        <w:t>Languages: English · isiZulu · siSwati</w:t>
       </w:r>
     </w:p>
     <w:sectPr>
-      <w:footerReference w:type="default" r:id="rId9"/>
       <w:pgSz w:w="12240" w:h="15840"/>
-      <w:pgMar w:top="691" w:right="835" w:bottom="691" w:left="835" w:header="720" w:footer="720" w:gutter="0"/>
+      <w:pgMar w:top="936" w:right="1008" w:bottom="936" w:left="1008" w:header="720" w:footer="720" w:gutter="0"/>
       <w:cols w:space="720"/>
       <w:docGrid w:linePitch="360"/>
     </w:sectPr>
   </w:body>
 </w:document>
-</file>
-
-<file path=word/footer1.xml><?xml version="1.0" encoding="utf-8"?>
-<w:ftr xmlns:m="http://schemas.openxmlformats.org/officeDocument/2006/math" xmlns:mc="http://schemas.openxmlformats.org/markup-compatibility/2006" xmlns:mo="http://schemas.microsoft.com/office/mac/office/2008/main" xmlns:mv="urn:schemas-microsoft-com:mac:vml" xmlns:o="urn:schemas-microsoft-com:office:office" xmlns:r="http://schemas.openxmlformats.org/officeDocument/2006/relationships" xmlns:v="urn:schemas-microsoft-com:vml" xmlns:w10="urn:schemas-microsoft-com:office:word" xmlns:w14="http://schemas.microsoft.com/office/word/2010/wordml" xmlns:w="http://schemas.openxmlformats.org/wordprocessingml/2006/main" xmlns:wne="http://schemas.microsoft.com/office/word/2006/wordml" xmlns:wp14="http://schemas.microsoft.com/office/word/2010/wordprocessingDrawing" xmlns:wp="http://schemas.openxmlformats.org/drawingml/2006/wordprocessingDrawing" xmlns:wpc="http://schemas.microsoft.com/office/word/2010/wordprocessingCanvas" xmlns:wpg="http://schemas.microsoft.com/office/word/2010/wordprocessingGroup" xmlns:wpi="http://schemas.microsoft.com/office/word/2010/wordprocessingInk" xmlns:wps="http://schemas.microsoft.com/office/word/2010/wordprocessingShape" mc:Ignorable="w14 wp14">
-  <w:p>
-    <w:pPr>
-      <w:pStyle w:val="Footer"/>
-      <w:jc w:val="center"/>
-    </w:pPr>
-    <w:r>
-      <w:rPr>
-        <w:color w:val="5A6470"/>
-        <w:sz w:val="15"/>
-      </w:rPr>
-      <w:t>Bheki Christopher Thobela  |  Professional CV  |  2026</w:t>
-    </w:r>
-  </w:p>
-</w:ftr>
 </file>
 
 <file path=word/numbering.xml><?xml version="1.0" encoding="utf-8"?>
@@ -1263,11 +1044,12 @@
     <w:qFormat/>
     <w:rsid w:val="00FC693F"/>
     <w:pPr>
-      <w:spacing w:after="50"/>
+      <w:spacing w:after="100" w:line="254" w:lineRule="auto"/>
     </w:pPr>
     <w:rPr>
-      <w:rFonts w:ascii="Aptos" w:hAnsi="Aptos"/>
-      <w:sz w:val="18"/>
+      <w:rFonts w:ascii="Calibri" w:hAnsi="Calibri"/>
+      <w:color w:val="000000"/>
+      <w:sz w:val="21"/>
     </w:rPr>
   </w:style>
   <w:style w:type="paragraph" w:styleId="Header">
@@ -1325,15 +1107,15 @@
     <w:pPr>
       <w:keepNext/>
       <w:keepLines/>
-      <w:spacing w:before="480" w:after="0"/>
+      <w:spacing w:before="200" w:after="100"/>
       <w:outlineLvl w:val="0"/>
     </w:pPr>
     <w:rPr>
-      <w:rFonts w:asciiTheme="majorHAnsi" w:eastAsiaTheme="majorEastAsia" w:hAnsiTheme="majorHAnsi" w:cstheme="majorBidi"/>
+      <w:rFonts w:asciiTheme="majorHAnsi" w:eastAsiaTheme="majorEastAsia" w:hAnsiTheme="majorHAnsi" w:cstheme="majorBidi" w:ascii="Calibri" w:hAnsi="Calibri"/>
       <w:b/>
       <w:bCs/>
-      <w:color w:val="365F91" w:themeColor="accent1" w:themeShade="BF"/>
-      <w:sz w:val="28"/>
+      <w:color w:val="000000"/>
+      <w:sz w:val="24"/>
       <w:szCs w:val="28"/>
     </w:rPr>
   </w:style>
@@ -1349,15 +1131,15 @@
     <w:pPr>
       <w:keepNext/>
       <w:keepLines/>
-      <w:spacing w:before="200" w:after="0"/>
+      <w:spacing w:before="200" w:after="100"/>
       <w:outlineLvl w:val="1"/>
     </w:pPr>
     <w:rPr>
-      <w:rFonts w:asciiTheme="majorHAnsi" w:eastAsiaTheme="majorEastAsia" w:hAnsiTheme="majorHAnsi" w:cstheme="majorBidi"/>
+      <w:rFonts w:asciiTheme="majorHAnsi" w:eastAsiaTheme="majorEastAsia" w:hAnsiTheme="majorHAnsi" w:cstheme="majorBidi" w:ascii="Calibri" w:hAnsi="Calibri"/>
       <w:b/>
       <w:bCs/>
-      <w:color w:val="4F81BD" w:themeColor="accent1"/>
-      <w:sz w:val="26"/>
+      <w:color w:val="000000"/>
+      <w:sz w:val="22"/>
       <w:szCs w:val="26"/>
     </w:rPr>
   </w:style>
@@ -1611,18 +1393,16 @@
     <w:qFormat/>
     <w:rsid w:val="00FC693F"/>
     <w:pPr>
-      <w:pBdr>
-        <w:bottom w:val="single" w:sz="8" w:space="4" w:color="4F81BD" w:themeColor="accent1"/>
-      </w:pBdr>
-      <w:spacing w:after="300" w:line="240" w:lineRule="auto"/>
+      <w:spacing w:after="100" w:line="240" w:lineRule="auto" w:before="0"/>
       <w:contextualSpacing/>
     </w:pPr>
     <w:rPr>
-      <w:rFonts w:asciiTheme="majorHAnsi" w:eastAsiaTheme="majorEastAsia" w:hAnsiTheme="majorHAnsi" w:cstheme="majorBidi"/>
-      <w:color w:val="17365D" w:themeColor="text2" w:themeShade="BF"/>
+      <w:rFonts w:asciiTheme="majorHAnsi" w:eastAsiaTheme="majorEastAsia" w:hAnsiTheme="majorHAnsi" w:cstheme="majorBidi" w:ascii="Calibri" w:hAnsi="Calibri"/>
+      <w:b/>
+      <w:color w:val="000000"/>
       <w:spacing w:val="5"/>
       <w:kern w:val="28"/>
-      <w:sz w:val="52"/>
+      <w:sz w:val="38"/>
       <w:szCs w:val="52"/>
     </w:rPr>
   </w:style>
@@ -2098,9 +1878,6 @@
     <w:qFormat/>
     <w:rsid w:val="00FC693F"/>
     <w:pPr>
-      <w:pBdr>
-        <w:bottom w:val="single" w:sz="4" w:space="4" w:color="4F81BD" w:themeColor="accent1"/>
-      </w:pBdr>
       <w:spacing w:before="200" w:after="280"/>
       <w:ind w:left="936" w:right="936"/>
     </w:pPr>
@@ -12951,30 +12728,6 @@
         <w:shd w:val="clear" w:color="auto" w:fill="FBCAA2" w:themeFill="accent6" w:themeFillTint="7F"/>
       </w:tcPr>
     </w:tblStylePr>
-  </w:style>
-  <w:style w:type="paragraph" w:customStyle="1" w:styleId="CVHeading">
-    <w:name w:val="CV Heading"/>
-    <w:pPr>
-      <w:spacing w:before="100" w:after="40"/>
-    </w:pPr>
-    <w:rPr>
-      <w:rFonts w:ascii="Aptos Display" w:hAnsi="Aptos Display"/>
-      <w:b/>
-      <w:color w:val="14243A"/>
-      <w:sz w:val="21"/>
-    </w:rPr>
-  </w:style>
-  <w:style w:type="paragraph" w:customStyle="1" w:styleId="CVRole">
-    <w:name w:val="CV Role"/>
-    <w:pPr>
-      <w:spacing w:before="100" w:after="40"/>
-    </w:pPr>
-    <w:rPr>
-      <w:rFonts w:ascii="Aptos Display" w:hAnsi="Aptos Display"/>
-      <w:b/>
-      <w:color w:val="2F6690"/>
-      <w:sz w:val="19"/>
-    </w:rPr>
   </w:style>
 </w:styles>
 </file>

</xml_diff>